<commit_message>
docs: add screenshots and produce training videos
</commit_message>
<xml_diff>
--- a/docs/TECHNICAL_MAINTENANCE_MANUAL.docx
+++ b/docs/TECHNICAL_MAINTENANCE_MANUAL.docx
@@ -3619,6 +3619,247 @@
           <w:color w:val="18181B"/>
         </w:rPr>
         <w:t>[ ] Browser check desktop/mobile se cambia UI.</w:t>
+      </w:r>
+    </w:p>
+    <w:p>
+      <w:r>
+        <w:br w:type="page"/>
+      </w:r>
+    </w:p>
+    <w:p>
+      <w:pPr>
+        <w:pStyle w:val="Heading1"/>
+      </w:pPr>
+      <w:r>
+        <w:rPr>
+          <w:rFonts w:ascii="Calibri" w:hAnsi="Calibri" w:eastAsia="Calibri"/>
+          <w:b/>
+          <w:color w:val="E12A1C"/>
+          <w:sz w:val="32"/>
+        </w:rPr>
+        <w:t>Riferimenti visuali per manutenzione</w:t>
+      </w:r>
+    </w:p>
+    <w:p>
+      <w:r>
+        <w:rPr>
+          <w:rFonts w:ascii="Calibri" w:hAnsi="Calibri" w:eastAsia="Calibri"/>
+          <w:color w:val="18181B"/>
+          <w:sz w:val="21"/>
+        </w:rPr>
+        <w:t>Queste schermate aiutano a riconoscere lo stato atteso dell interfaccia dopo deploy, restore o modifiche UI. Le verifiche tecniche restano quelle documentate nelle checklist.</w:t>
+      </w:r>
+    </w:p>
+    <w:p>
+      <w:pPr>
+        <w:jc w:val="center"/>
+      </w:pPr>
+      <w:r>
+        <w:drawing>
+          <wp:inline xmlns:a="http://schemas.openxmlformats.org/drawingml/2006/main" xmlns:pic="http://schemas.openxmlformats.org/drawingml/2006/picture">
+            <wp:extent cx="5715000" cy="2851145"/>
+            <wp:docPr id="1" name="Picture 1"/>
+            <wp:cNvGraphicFramePr>
+              <a:graphicFrameLocks noChangeAspect="1"/>
+            </wp:cNvGraphicFramePr>
+            <a:graphic>
+              <a:graphicData uri="http://schemas.openxmlformats.org/drawingml/2006/picture">
+                <pic:pic>
+                  <pic:nvPicPr>
+                    <pic:cNvPr id="0" name="01-login.png"/>
+                    <pic:cNvPicPr/>
+                  </pic:nvPicPr>
+                  <pic:blipFill>
+                    <a:blip r:embed="rId11"/>
+                    <a:stretch>
+                      <a:fillRect/>
+                    </a:stretch>
+                  </pic:blipFill>
+                  <pic:spPr>
+                    <a:xfrm>
+                      <a:off x="0" y="0"/>
+                      <a:ext cx="5715000" cy="2851145"/>
+                    </a:xfrm>
+                    <a:prstGeom prst="rect"/>
+                  </pic:spPr>
+                </pic:pic>
+              </a:graphicData>
+            </a:graphic>
+          </wp:inline>
+        </w:drawing>
+      </w:r>
+    </w:p>
+    <w:p>
+      <w:pPr>
+        <w:spacing w:after="200"/>
+        <w:jc w:val="center"/>
+      </w:pPr>
+      <w:r>
+        <w:rPr>
+          <w:rFonts w:ascii="Calibri" w:hAnsi="Calibri" w:eastAsia="Calibri"/>
+          <w:color w:val="71717A"/>
+          <w:sz w:val="18"/>
+        </w:rPr>
+        <w:t>Login amministratore brandizzato</w:t>
+      </w:r>
+    </w:p>
+    <w:p>
+      <w:pPr>
+        <w:jc w:val="center"/>
+      </w:pPr>
+      <w:r>
+        <w:drawing>
+          <wp:inline xmlns:a="http://schemas.openxmlformats.org/drawingml/2006/main" xmlns:pic="http://schemas.openxmlformats.org/drawingml/2006/picture">
+            <wp:extent cx="5715000" cy="2851145"/>
+            <wp:docPr id="2" name="Picture 2"/>
+            <wp:cNvGraphicFramePr>
+              <a:graphicFrameLocks noChangeAspect="1"/>
+            </wp:cNvGraphicFramePr>
+            <a:graphic>
+              <a:graphicData uri="http://schemas.openxmlformats.org/drawingml/2006/picture">
+                <pic:pic>
+                  <pic:nvPicPr>
+                    <pic:cNvPr id="0" name="02-dashboard.png"/>
+                    <pic:cNvPicPr/>
+                  </pic:nvPicPr>
+                  <pic:blipFill>
+                    <a:blip r:embed="rId12"/>
+                    <a:stretch>
+                      <a:fillRect/>
+                    </a:stretch>
+                  </pic:blipFill>
+                  <pic:spPr>
+                    <a:xfrm>
+                      <a:off x="0" y="0"/>
+                      <a:ext cx="5715000" cy="2851145"/>
+                    </a:xfrm>
+                    <a:prstGeom prst="rect"/>
+                  </pic:spPr>
+                </pic:pic>
+              </a:graphicData>
+            </a:graphic>
+          </wp:inline>
+        </w:drawing>
+      </w:r>
+    </w:p>
+    <w:p>
+      <w:pPr>
+        <w:spacing w:after="200"/>
+        <w:jc w:val="center"/>
+      </w:pPr>
+      <w:r>
+        <w:rPr>
+          <w:rFonts w:ascii="Calibri" w:hAnsi="Calibri" w:eastAsia="Calibri"/>
+          <w:color w:val="71717A"/>
+          <w:sz w:val="18"/>
+        </w:rPr>
+        <w:t>Dashboard operativa</w:t>
+      </w:r>
+    </w:p>
+    <w:p>
+      <w:pPr>
+        <w:jc w:val="center"/>
+      </w:pPr>
+      <w:r>
+        <w:drawing>
+          <wp:inline xmlns:a="http://schemas.openxmlformats.org/drawingml/2006/main" xmlns:pic="http://schemas.openxmlformats.org/drawingml/2006/picture">
+            <wp:extent cx="5715000" cy="2851145"/>
+            <wp:docPr id="3" name="Picture 3"/>
+            <wp:cNvGraphicFramePr>
+              <a:graphicFrameLocks noChangeAspect="1"/>
+            </wp:cNvGraphicFramePr>
+            <a:graphic>
+              <a:graphicData uri="http://schemas.openxmlformats.org/drawingml/2006/picture">
+                <pic:pic>
+                  <pic:nvPicPr>
+                    <pic:cNvPr id="0" name="03-members.png"/>
+                    <pic:cNvPicPr/>
+                  </pic:nvPicPr>
+                  <pic:blipFill>
+                    <a:blip r:embed="rId13"/>
+                    <a:stretch>
+                      <a:fillRect/>
+                    </a:stretch>
+                  </pic:blipFill>
+                  <pic:spPr>
+                    <a:xfrm>
+                      <a:off x="0" y="0"/>
+                      <a:ext cx="5715000" cy="2851145"/>
+                    </a:xfrm>
+                    <a:prstGeom prst="rect"/>
+                  </pic:spPr>
+                </pic:pic>
+              </a:graphicData>
+            </a:graphic>
+          </wp:inline>
+        </w:drawing>
+      </w:r>
+    </w:p>
+    <w:p>
+      <w:pPr>
+        <w:spacing w:after="200"/>
+        <w:jc w:val="center"/>
+      </w:pPr>
+      <w:r>
+        <w:rPr>
+          <w:rFonts w:ascii="Calibri" w:hAnsi="Calibri" w:eastAsia="Calibri"/>
+          <w:color w:val="71717A"/>
+          <w:sz w:val="18"/>
+        </w:rPr>
+        <w:t>Elenco soci con filtri e ordinamento</w:t>
+      </w:r>
+    </w:p>
+    <w:p>
+      <w:pPr>
+        <w:jc w:val="center"/>
+      </w:pPr>
+      <w:r>
+        <w:drawing>
+          <wp:inline xmlns:a="http://schemas.openxmlformats.org/drawingml/2006/main" xmlns:pic="http://schemas.openxmlformats.org/drawingml/2006/picture">
+            <wp:extent cx="5715000" cy="2851145"/>
+            <wp:docPr id="4" name="Picture 4"/>
+            <wp:cNvGraphicFramePr>
+              <a:graphicFrameLocks noChangeAspect="1"/>
+            </wp:cNvGraphicFramePr>
+            <a:graphic>
+              <a:graphicData uri="http://schemas.openxmlformats.org/drawingml/2006/picture">
+                <pic:pic>
+                  <pic:nvPicPr>
+                    <pic:cNvPr id="0" name="09-reports.png"/>
+                    <pic:cNvPicPr/>
+                  </pic:nvPicPr>
+                  <pic:blipFill>
+                    <a:blip r:embed="rId14"/>
+                    <a:stretch>
+                      <a:fillRect/>
+                    </a:stretch>
+                  </pic:blipFill>
+                  <pic:spPr>
+                    <a:xfrm>
+                      <a:off x="0" y="0"/>
+                      <a:ext cx="5715000" cy="2851145"/>
+                    </a:xfrm>
+                    <a:prstGeom prst="rect"/>
+                  </pic:spPr>
+                </pic:pic>
+              </a:graphicData>
+            </a:graphic>
+          </wp:inline>
+        </w:drawing>
+      </w:r>
+    </w:p>
+    <w:p>
+      <w:pPr>
+        <w:spacing w:after="200"/>
+        <w:jc w:val="center"/>
+      </w:pPr>
+      <w:r>
+        <w:rPr>
+          <w:rFonts w:ascii="Calibri" w:hAnsi="Calibri" w:eastAsia="Calibri"/>
+          <w:color w:val="71717A"/>
+          <w:sz w:val="18"/>
+        </w:rPr>
+        <w:t>Report ed export CSV/XLSX</w:t>
       </w:r>
     </w:p>
     <w:sectPr>

</xml_diff>